<commit_message>
Docs: describe the 409 on a second auto-fix sweep in the backend guide
Co-Authored-By: Claude Sonnet 5.5 <noreply@anthropic.com>
Claude-Session: https://claude.ai/code/session_01V4Bpfd8j7jamueLgex2qJm
</commit_message>
<xml_diff>
--- a/backend/docs/StrawSlot-Backend-Architecture-and-Operations-Guide.docx
+++ b/backend/docs/StrawSlot-Backend-Architecture-and-Operations-Guide.docx
@@ -2553,7 +2553,23 @@
           <w:b w:val="0"/>
           <w:i w:val="0"/>
         </w:rPr>
-        <w:t xml:space="preserve"> around officer read-modify-write operations (auto-fix, reassign), so two officers cannot interleave and overwrite each other’s pins.</w:t>
+        <w:t xml:space="preserve"> around officer read-modify-write operations (auto-fix, reassign), so two officers cannot interleave and overwrite each other’s pins. A second “auto-fix all” while one is running gets an immediate </w:t>
+      </w:r>
+      <w:r>
+        <w:rPr>
+          <w:rFonts w:ascii="Consolas" w:hAnsi="Consolas" w:eastAsia="Consolas"/>
+          <w:b w:val="0"/>
+          <w:i w:val="0"/>
+          <w:sz w:val="19"/>
+        </w:rPr>
+        <w:t>409</w:t>
+      </w:r>
+      <w:r>
+        <w:rPr>
+          <w:b w:val="0"/>
+          <w:i w:val="0"/>
+        </w:rPr>
+        <w:t>.</w:t>
       </w:r>
     </w:p>
     <w:p>
@@ -8867,7 +8883,23 @@
           <w:b w:val="0"/>
           <w:i w:val="0"/>
         </w:rPr>
-        <w:t>Related measurement: the “auto-fix all” action is CPU-bound (about 4–5 s per call on this sandbox, time-boxed to 6.5 s inside the request). Concurrent calls serialise correctly behind the district lock; three simultaneous calls finished cleanly in about 14 s. For production it should become an asynchronous job with a status endpoint.</w:t>
+        <w:t xml:space="preserve">Related measurement: the “auto-fix all” action is CPU-bound (about 4–5 s per call on this sandbox, time-boxed to 6.5 s inside the request). If a second sweep is requested while one is running, the API answers </w:t>
+      </w:r>
+      <w:r>
+        <w:rPr>
+          <w:rFonts w:ascii="Consolas" w:hAnsi="Consolas" w:eastAsia="Consolas"/>
+          <w:b w:val="0"/>
+          <w:i w:val="0"/>
+          <w:sz w:val="19"/>
+        </w:rPr>
+        <w:t>409</w:t>
+      </w:r>
+      <w:r>
+        <w:rPr>
+          <w:b w:val="0"/>
+          <w:i w:val="0"/>
+        </w:rPr>
+        <w:t xml:space="preserve"> straight away instead of queueing it behind the first (found when queued calls hit the request timeout in CI). For production it should become an asynchronous job with a status endpoint.</w:t>
       </w:r>
     </w:p>
     <w:p>
@@ -10334,7 +10366,7 @@
                 <w:i w:val="0"/>
                 <w:sz w:val="19"/>
               </w:rPr>
-              <w:t>40 simultaneous bookings → unique ids and 8 computations; parallel auto-fix serialises; optimistic locking; 200 cached reads → 0 computations</w:t>
+              <w:t>40 simultaneous bookings → unique ids and 8 computations; parallel auto-fix sweeps: one runs, others get 409; optimistic locking; 200 cached reads → 0 computations</w:t>
             </w:r>
           </w:p>
         </w:tc>

</xml_diff>